<commit_message>
assignment 2 done - now time to check work
</commit_message>
<xml_diff>
--- a/Assignment 2/Assignment2.docx
+++ b/Assignment 2/Assignment2.docx
@@ -294,13 +294,7 @@
         <w:rPr>
           <w:lang w:val="en-CA"/>
         </w:rPr>
-        <w:t xml:space="preserve"> slow the performance of a database.</w:t>
-      </w:r>
-      <w:r>
-        <w:rPr>
-          <w:lang w:val="en-CA"/>
-        </w:rPr>
-        <w:t xml:space="preserve">  </w:t>
+        <w:t xml:space="preserve"> slow the performance of a database.  </w:t>
       </w:r>
       <w:r>
         <w:rPr>
@@ -350,19 +344,11 @@
         </w:rPr>
         <w:t xml:space="preserve">xes can consume great deals of storage space, which can impose financial costs as well. </w:t>
       </w:r>
-      <w:proofErr w:type="gramStart"/>
-      <w:r>
-        <w:rPr>
-          <w:lang w:val="en-CA"/>
-        </w:rPr>
-        <w:t>Analysis</w:t>
-      </w:r>
-      <w:proofErr w:type="gramEnd"/>
-      <w:r>
-        <w:rPr>
-          <w:lang w:val="en-CA"/>
-        </w:rPr>
-        <w:t xml:space="preserve"> of how a table will be used must be considered when determining which tables to index and how.</w:t>
+      <w:r>
+        <w:rPr>
+          <w:lang w:val="en-CA"/>
+        </w:rPr>
+        <w:t>Analysis of how a table will be used must be considered when determining which tables to index and how.</w:t>
       </w:r>
       <w:r>
         <w:rPr>
@@ -4609,19 +4595,7 @@
         <w:rPr>
           <w:lang w:val="en-CA"/>
         </w:rPr>
-        <w:t xml:space="preserve"> = ‘COMP </w:t>
-      </w:r>
-      <w:r>
-        <w:rPr>
-          <w:lang w:val="en-CA"/>
-        </w:rPr>
-        <w:t xml:space="preserve">418’ </w:t>
-      </w:r>
-      <w:r>
-        <w:rPr>
-          <w:lang w:val="en-CA"/>
-        </w:rPr>
-        <w:t xml:space="preserve">and ( </w:t>
+        <w:t xml:space="preserve"> = ‘COMP 418’ and ( </w:t>
       </w:r>
       <w:proofErr w:type="spellStart"/>
       <w:r>
@@ -4960,25 +4934,61 @@
         <w:rPr>
           <w:lang w:val="en-CA"/>
         </w:rPr>
-        <w:t xml:space="preserve"> accidental loss due to hardware, software failure or human error</w:t>
-      </w:r>
-      <w:r>
-        <w:rPr>
-          <w:lang w:val="en-CA"/>
-        </w:rPr>
-        <w:t xml:space="preserve">; theft or fraud where people perpetrate </w:t>
-      </w:r>
-      <w:r>
-        <w:rPr>
-          <w:lang w:val="en-CA"/>
-        </w:rPr>
-        <w:t xml:space="preserve">activities to steal or alter data; loss of privacy or confidentiality, where protected or private information is accessed or distributed without permission; </w:t>
-      </w:r>
-      <w:r>
-        <w:rPr>
-          <w:lang w:val="en-CA"/>
-        </w:rPr>
-        <w:t xml:space="preserve">and loss of availability, where the </w:t>
+        <w:t xml:space="preserve"> accidental loss</w:t>
+      </w:r>
+      <w:r>
+        <w:rPr>
+          <w:lang w:val="en-CA"/>
+        </w:rPr>
+        <w:t xml:space="preserve"> of data</w:t>
+      </w:r>
+      <w:r>
+        <w:rPr>
+          <w:lang w:val="en-CA"/>
+        </w:rPr>
+        <w:t xml:space="preserve">, </w:t>
+      </w:r>
+      <w:r>
+        <w:rPr>
+          <w:lang w:val="en-CA"/>
+        </w:rPr>
+        <w:t>theft or fraud, loss of privacy or confidentiality, loss of data integrity</w:t>
+      </w:r>
+      <w:r>
+        <w:rPr>
+          <w:lang w:val="en-CA"/>
+        </w:rPr>
+        <w:t xml:space="preserve"> and </w:t>
+      </w:r>
+      <w:r>
+        <w:rPr>
+          <w:lang w:val="en-CA"/>
+        </w:rPr>
+        <w:t>loss of availability</w:t>
+      </w:r>
+      <w:r>
+        <w:rPr>
+          <w:lang w:val="en-CA"/>
+        </w:rPr>
+        <w:t>.</w:t>
+      </w:r>
+    </w:p>
+    <w:p>
+      <w:pPr>
+        <w:pStyle w:val="ListNumber2"/>
+        <w:numPr>
+          <w:ilvl w:val="1"/>
+          <w:numId w:val="123"/>
+        </w:numPr>
+        <w:rPr>
+          <w:lang w:val="en-CA"/>
+        </w:rPr>
+      </w:pPr>
+      <w:r>
+        <w:rPr>
+          <w:lang w:val="en-CA"/>
+        </w:rPr>
+        <w:t>Accidental loss of data</w:t>
       </w:r>
       <w:r>
         <w:rPr>
@@ -4986,10 +4996,277 @@
         </w:rPr>
         <w:t xml:space="preserve"> </w:t>
       </w:r>
+      <w:r>
+        <w:rPr>
+          <w:lang w:val="en-CA"/>
+        </w:rPr>
+        <w:t xml:space="preserve">could be a result of hardware </w:t>
+      </w:r>
+      <w:r>
+        <w:rPr>
+          <w:lang w:val="en-CA"/>
+        </w:rPr>
+        <w:t xml:space="preserve">or software </w:t>
+      </w:r>
+      <w:r>
+        <w:rPr>
+          <w:lang w:val="en-CA"/>
+        </w:rPr>
+        <w:t>failure</w:t>
+      </w:r>
+      <w:r>
+        <w:rPr>
+          <w:lang w:val="en-CA"/>
+        </w:rPr>
+        <w:t xml:space="preserve"> or human error</w:t>
+      </w:r>
+      <w:r>
+        <w:rPr>
+          <w:lang w:val="en-CA"/>
+        </w:rPr>
+        <w:t xml:space="preserve">. Special steps must be taken to protect against these such as user </w:t>
+      </w:r>
+      <w:proofErr w:type="spellStart"/>
+      <w:r>
+        <w:rPr>
+          <w:lang w:val="en-CA"/>
+        </w:rPr>
+        <w:t>authroztaion</w:t>
+      </w:r>
+      <w:proofErr w:type="spellEnd"/>
+      <w:r>
+        <w:rPr>
+          <w:lang w:val="en-CA"/>
+        </w:rPr>
+        <w:t xml:space="preserve">, </w:t>
+      </w:r>
+      <w:r>
+        <w:rPr>
+          <w:lang w:val="en-CA"/>
+        </w:rPr>
+        <w:t>software or hardware maintenance and controls and other policies.</w:t>
+      </w:r>
+      <w:r>
+        <w:rPr>
+          <w:lang w:val="en-CA"/>
+        </w:rPr>
+        <w:t xml:space="preserve"> </w:t>
+      </w:r>
     </w:p>
     <w:p>
       <w:pPr>
         <w:pStyle w:val="ListNumber2"/>
+        <w:numPr>
+          <w:ilvl w:val="1"/>
+          <w:numId w:val="123"/>
+        </w:numPr>
+        <w:rPr>
+          <w:lang w:val="en-CA"/>
+        </w:rPr>
+      </w:pPr>
+      <w:r>
+        <w:rPr>
+          <w:lang w:val="en-CA"/>
+        </w:rPr>
+        <w:t xml:space="preserve">Theft or fraud are caused by people to access, alter information or damage infrastructure. </w:t>
+      </w:r>
+      <w:r>
+        <w:rPr>
+          <w:lang w:val="en-CA"/>
+        </w:rPr>
+        <w:t xml:space="preserve"> Physical and electronic </w:t>
+      </w:r>
+      <w:r>
+        <w:rPr>
+          <w:lang w:val="en-CA"/>
+        </w:rPr>
+        <w:t xml:space="preserve">controls must be used to prevent </w:t>
+      </w:r>
+      <w:proofErr w:type="spellStart"/>
+      <w:r>
+        <w:rPr>
+          <w:lang w:val="en-CA"/>
+        </w:rPr>
+        <w:t>unauthrozied</w:t>
+      </w:r>
+      <w:proofErr w:type="spellEnd"/>
+      <w:r>
+        <w:rPr>
+          <w:lang w:val="en-CA"/>
+        </w:rPr>
+        <w:t xml:space="preserve"> persons to gain access to physical locations or firewalls</w:t>
+      </w:r>
+      <w:r>
+        <w:rPr>
+          <w:lang w:val="en-CA"/>
+        </w:rPr>
+        <w:t xml:space="preserve"> to prevent inappropriate connections.</w:t>
+      </w:r>
+    </w:p>
+    <w:p>
+      <w:pPr>
+        <w:pStyle w:val="ListNumber2"/>
+        <w:numPr>
+          <w:ilvl w:val="1"/>
+          <w:numId w:val="123"/>
+        </w:numPr>
+        <w:rPr>
+          <w:lang w:val="en-CA"/>
+        </w:rPr>
+      </w:pPr>
+      <w:r>
+        <w:rPr>
+          <w:lang w:val="en-CA"/>
+        </w:rPr>
+        <w:lastRenderedPageBreak/>
+        <w:t xml:space="preserve">Loss of privacy or confidentiality </w:t>
+      </w:r>
+      <w:r>
+        <w:rPr>
+          <w:lang w:val="en-CA"/>
+        </w:rPr>
+        <w:t xml:space="preserve">means loss of protection of </w:t>
+      </w:r>
+      <w:proofErr w:type="spellStart"/>
+      <w:r>
+        <w:rPr>
+          <w:lang w:val="en-CA"/>
+        </w:rPr>
+        <w:t>data</w:t>
+      </w:r>
+      <w:r>
+        <w:rPr>
+          <w:lang w:val="en-CA"/>
+        </w:rPr>
+        <w:t>or</w:t>
+      </w:r>
+      <w:proofErr w:type="spellEnd"/>
+      <w:r>
+        <w:rPr>
+          <w:lang w:val="en-CA"/>
+        </w:rPr>
+        <w:t xml:space="preserve"> </w:t>
+      </w:r>
+      <w:r>
+        <w:rPr>
+          <w:lang w:val="en-CA"/>
+        </w:rPr>
+        <w:t xml:space="preserve">loss of protection of critical organizational data. This can lead to blackmail, bribery, </w:t>
+      </w:r>
+      <w:proofErr w:type="spellStart"/>
+      <w:r>
+        <w:rPr>
+          <w:lang w:val="en-CA"/>
+        </w:rPr>
+        <w:t>embarassement</w:t>
+      </w:r>
+      <w:proofErr w:type="spellEnd"/>
+      <w:r>
+        <w:rPr>
+          <w:lang w:val="en-CA"/>
+        </w:rPr>
+        <w:t xml:space="preserve">, </w:t>
+      </w:r>
+      <w:r>
+        <w:rPr>
+          <w:lang w:val="en-CA"/>
+        </w:rPr>
+        <w:t xml:space="preserve">stolen passwords or more. Laws exist </w:t>
+      </w:r>
+      <w:r>
+        <w:rPr>
+          <w:lang w:val="en-CA"/>
+        </w:rPr>
+        <w:t xml:space="preserve">that require companies to communicate policies to ensure protection of </w:t>
+      </w:r>
+      <w:proofErr w:type="gramStart"/>
+      <w:r>
+        <w:rPr>
+          <w:lang w:val="en-CA"/>
+        </w:rPr>
+        <w:t>data, or</w:t>
+      </w:r>
+      <w:proofErr w:type="gramEnd"/>
+      <w:r>
+        <w:rPr>
+          <w:lang w:val="en-CA"/>
+        </w:rPr>
+        <w:t xml:space="preserve"> notify </w:t>
+      </w:r>
+      <w:r>
+        <w:rPr>
+          <w:lang w:val="en-CA"/>
+        </w:rPr>
+        <w:t>users of possible exposure.</w:t>
+      </w:r>
+    </w:p>
+    <w:p>
+      <w:pPr>
+        <w:pStyle w:val="ListNumber2"/>
+        <w:numPr>
+          <w:ilvl w:val="1"/>
+          <w:numId w:val="123"/>
+        </w:numPr>
+        <w:rPr>
+          <w:lang w:val="en-CA"/>
+        </w:rPr>
+      </w:pPr>
+      <w:r>
+        <w:rPr>
+          <w:lang w:val="en-CA"/>
+        </w:rPr>
+        <w:t xml:space="preserve">Loss of availability is </w:t>
+      </w:r>
+      <w:r>
+        <w:rPr>
+          <w:lang w:val="en-CA"/>
+        </w:rPr>
+        <w:t>when an application becomes unavailable to users, which can lead to several operational difficulties.  It is typically caused by sabotage of hardware, network or applications.</w:t>
+      </w:r>
+      <w:r>
+        <w:rPr>
+          <w:lang w:val="en-CA"/>
+        </w:rPr>
+        <w:t xml:space="preserve">  Loss of </w:t>
+      </w:r>
+      <w:r>
+        <w:rPr>
+          <w:lang w:val="en-CA"/>
+        </w:rPr>
+        <w:t xml:space="preserve">availability </w:t>
+      </w:r>
+      <w:proofErr w:type="gramStart"/>
+      <w:r>
+        <w:rPr>
+          <w:lang w:val="en-CA"/>
+        </w:rPr>
+        <w:t>an</w:t>
+      </w:r>
+      <w:proofErr w:type="gramEnd"/>
+      <w:r>
+        <w:rPr>
+          <w:lang w:val="en-CA"/>
+        </w:rPr>
+        <w:t xml:space="preserve"> be caused by viruses, so virus protection is important to implement and keep up to date. Intentional attacks or software bugs can also lead to loss of availability.</w:t>
+      </w:r>
+    </w:p>
+    <w:p>
+      <w:pPr>
+        <w:pStyle w:val="ListNumber2"/>
+        <w:numPr>
+          <w:ilvl w:val="0"/>
+          <w:numId w:val="0"/>
+        </w:numPr>
+        <w:ind w:left="1723"/>
+        <w:rPr>
+          <w:highlight w:val="yellow"/>
+          <w:lang w:val="en-CA"/>
+        </w:rPr>
+      </w:pPr>
+    </w:p>
+    <w:p>
+      <w:pPr>
+        <w:pStyle w:val="ListNumber2"/>
         <w:rPr>
           <w:lang w:val="en-CA"/>
         </w:rPr>
@@ -4999,6 +5276,135 @@
           <w:lang w:val="en-CA"/>
         </w:rPr>
         <w:t>What is the difference between shared locks and exclusive locks?</w:t>
+      </w:r>
+    </w:p>
+    <w:p>
+      <w:pPr>
+        <w:pStyle w:val="ListNumber2"/>
+        <w:numPr>
+          <w:ilvl w:val="0"/>
+          <w:numId w:val="0"/>
+        </w:numPr>
+        <w:ind w:left="1080"/>
+        <w:rPr>
+          <w:lang w:val="en-CA"/>
+        </w:rPr>
+      </w:pPr>
+      <w:r>
+        <w:rPr>
+          <w:lang w:val="en-CA"/>
+        </w:rPr>
+        <w:t xml:space="preserve">Locking is the process of </w:t>
+      </w:r>
+      <w:r>
+        <w:rPr>
+          <w:lang w:val="en-CA"/>
+        </w:rPr>
+        <w:t xml:space="preserve">blocking or denying access to any data until a transaction has been completed. Locks can be applied </w:t>
+      </w:r>
+      <w:r>
+        <w:rPr>
+          <w:lang w:val="en-CA"/>
+        </w:rPr>
+        <w:t xml:space="preserve">at a variety of different levels; database, table, block (or page), record, or field.  </w:t>
+      </w:r>
+      <w:r>
+        <w:rPr>
+          <w:lang w:val="en-CA"/>
+        </w:rPr>
+        <w:t xml:space="preserve">These locks can be one of two </w:t>
+      </w:r>
+      <w:proofErr w:type="gramStart"/>
+      <w:r>
+        <w:rPr>
+          <w:lang w:val="en-CA"/>
+        </w:rPr>
+        <w:t>types;</w:t>
+      </w:r>
+      <w:proofErr w:type="gramEnd"/>
+      <w:r>
+        <w:rPr>
+          <w:lang w:val="en-CA"/>
+        </w:rPr>
+        <w:t xml:space="preserve"> either a shared lock or an exclusive lock.  A shared lock is where </w:t>
+      </w:r>
+      <w:r>
+        <w:rPr>
+          <w:lang w:val="en-CA"/>
+        </w:rPr>
+        <w:t xml:space="preserve">multiple processes may read from a piece of data, however updating of it is limited to one process at a </w:t>
+      </w:r>
+      <w:proofErr w:type="spellStart"/>
+      <w:r>
+        <w:rPr>
+          <w:lang w:val="en-CA"/>
+        </w:rPr>
+        <w:t>a</w:t>
+      </w:r>
+      <w:proofErr w:type="spellEnd"/>
+      <w:r>
+        <w:rPr>
+          <w:lang w:val="en-CA"/>
+        </w:rPr>
+        <w:t xml:space="preserve"> time.</w:t>
+      </w:r>
+      <w:r>
+        <w:rPr>
+          <w:lang w:val="en-CA"/>
+        </w:rPr>
+        <w:t xml:space="preserve">  </w:t>
+      </w:r>
+    </w:p>
+    <w:p>
+      <w:pPr>
+        <w:pStyle w:val="ListNumber2"/>
+        <w:numPr>
+          <w:ilvl w:val="0"/>
+          <w:numId w:val="0"/>
+        </w:numPr>
+        <w:ind w:left="1080"/>
+        <w:rPr>
+          <w:lang w:val="en-CA"/>
+        </w:rPr>
+      </w:pPr>
+      <w:r>
+        <w:rPr>
+          <w:lang w:val="en-CA"/>
+        </w:rPr>
+        <w:t xml:space="preserve">Exclusive locks are locks that prevent any other process from reading or updating from data </w:t>
+      </w:r>
+    </w:p>
+    <w:p>
+      <w:pPr>
+        <w:pStyle w:val="ListNumber2"/>
+        <w:numPr>
+          <w:ilvl w:val="0"/>
+          <w:numId w:val="0"/>
+        </w:numPr>
+        <w:ind w:left="1080"/>
+        <w:rPr>
+          <w:lang w:val="en-CA"/>
+        </w:rPr>
+      </w:pPr>
+      <w:r>
+        <w:rPr>
+          <w:lang w:val="en-CA"/>
+        </w:rPr>
+        <w:t xml:space="preserve">Both locks have their purposes, however shared locks are more appropriate for high availability multiple user system, because it allows increases available of data since only updates are affected by the lock. </w:t>
+      </w:r>
+      <w:proofErr w:type="spellStart"/>
+      <w:r>
+        <w:rPr>
+          <w:lang w:val="en-CA"/>
+        </w:rPr>
+        <w:t>Exclsuvie</w:t>
+      </w:r>
+      <w:proofErr w:type="spellEnd"/>
+      <w:r>
+        <w:rPr>
+          <w:lang w:val="en-CA"/>
+        </w:rPr>
+        <w:t xml:space="preserve"> locks however limit all types of activity to a data including read and update actions. </w:t>
       </w:r>
     </w:p>
     <w:p>
@@ -5033,7 +5439,7 @@
     </w:p>
     <w:tbl>
       <w:tblPr>
-        <w:tblW w:w="2500" w:type="pct"/>
+        <w:tblW w:w="3750" w:type="pct"/>
         <w:tblInd w:w="357" w:type="dxa"/>
         <w:tblBorders>
           <w:top w:val="double" w:sz="6" w:space="0" w:color="CCCCCC"/>
@@ -5048,8 +5454,9 @@
         <w:tblLook w:val="04A0" w:firstRow="1" w:lastRow="0" w:firstColumn="1" w:lastColumn="0" w:noHBand="0" w:noVBand="1"/>
       </w:tblPr>
       <w:tblGrid>
-        <w:gridCol w:w="2520"/>
-        <w:gridCol w:w="2520"/>
+        <w:gridCol w:w="2113"/>
+        <w:gridCol w:w="2113"/>
+        <w:gridCol w:w="3334"/>
       </w:tblGrid>
       <w:tr>
         <w:trPr>
@@ -5087,7 +5494,6 @@
                 <w:bCs/>
                 <w:lang w:val="en-CA"/>
               </w:rPr>
-              <w:lastRenderedPageBreak/>
               <w:t>T1</w:t>
             </w:r>
           </w:p>
@@ -5125,6 +5531,35 @@
                 <w:lang w:val="en-CA"/>
               </w:rPr>
               <w:t>T2</w:t>
+            </w:r>
+          </w:p>
+        </w:tc>
+        <w:tc>
+          <w:tcPr>
+            <w:tcW w:w="0" w:type="auto"/>
+            <w:tcBorders>
+              <w:top w:val="double" w:sz="6" w:space="0" w:color="CCCCCC"/>
+              <w:bottom w:val="nil"/>
+            </w:tcBorders>
+            <w:shd w:val="clear" w:color="auto" w:fill="EFEFEF"/>
+          </w:tcPr>
+          <w:p>
+            <w:pPr>
+              <w:pStyle w:val="ListContinue2"/>
+              <w:ind w:left="284"/>
+              <w:rPr>
+                <w:b/>
+                <w:bCs/>
+                <w:lang w:val="en-CA"/>
+              </w:rPr>
+            </w:pPr>
+            <w:r>
+              <w:rPr>
+                <w:b/>
+                <w:bCs/>
+                <w:lang w:val="en-CA"/>
+              </w:rPr>
+              <w:t>Issue</w:t>
             </w:r>
           </w:p>
         </w:tc>
@@ -5194,6 +5629,25 @@
             </w:r>
           </w:p>
         </w:tc>
+        <w:tc>
+          <w:tcPr>
+            <w:tcW w:w="0" w:type="auto"/>
+            <w:tcBorders>
+              <w:top w:val="nil"/>
+              <w:left w:val="single" w:sz="6" w:space="0" w:color="auto"/>
+              <w:bottom w:val="single" w:sz="6" w:space="0" w:color="auto"/>
+            </w:tcBorders>
+          </w:tcPr>
+          <w:p>
+            <w:pPr>
+              <w:pStyle w:val="ListContinue2"/>
+              <w:ind w:left="284"/>
+              <w:rPr>
+                <w:lang w:val="en-CA"/>
+              </w:rPr>
+            </w:pPr>
+          </w:p>
+        </w:tc>
       </w:tr>
       <w:tr>
         <w:tc>
@@ -5260,6 +5714,25 @@
             </w:r>
           </w:p>
         </w:tc>
+        <w:tc>
+          <w:tcPr>
+            <w:tcW w:w="0" w:type="auto"/>
+            <w:tcBorders>
+              <w:top w:val="single" w:sz="6" w:space="0" w:color="auto"/>
+              <w:left w:val="single" w:sz="6" w:space="0" w:color="auto"/>
+              <w:bottom w:val="single" w:sz="6" w:space="0" w:color="auto"/>
+            </w:tcBorders>
+          </w:tcPr>
+          <w:p>
+            <w:pPr>
+              <w:pStyle w:val="ListContinue2"/>
+              <w:ind w:left="284"/>
+              <w:rPr>
+                <w:lang w:val="en-CA"/>
+              </w:rPr>
+            </w:pPr>
+          </w:p>
+        </w:tc>
       </w:tr>
       <w:tr>
         <w:tc>
@@ -5323,6 +5796,43 @@
                 <w:lang w:val="en-CA"/>
               </w:rPr>
               <w:t>Read C</w:t>
+            </w:r>
+          </w:p>
+        </w:tc>
+        <w:tc>
+          <w:tcPr>
+            <w:tcW w:w="0" w:type="auto"/>
+            <w:tcBorders>
+              <w:top w:val="single" w:sz="6" w:space="0" w:color="auto"/>
+              <w:left w:val="single" w:sz="6" w:space="0" w:color="auto"/>
+              <w:bottom w:val="single" w:sz="6" w:space="0" w:color="auto"/>
+            </w:tcBorders>
+          </w:tcPr>
+          <w:p>
+            <w:pPr>
+              <w:pStyle w:val="ListContinue2"/>
+              <w:ind w:left="284"/>
+              <w:rPr>
+                <w:lang w:val="en-CA"/>
+              </w:rPr>
+            </w:pPr>
+            <w:r>
+              <w:rPr>
+                <w:lang w:val="en-CA"/>
+              </w:rPr>
+              <w:t xml:space="preserve">Dirty read on </w:t>
+            </w:r>
+            <w:r>
+              <w:rPr>
+                <w:lang w:val="en-CA"/>
+              </w:rPr>
+              <w:t>C</w:t>
+            </w:r>
+            <w:r>
+              <w:rPr>
+                <w:lang w:val="en-CA"/>
+              </w:rPr>
+              <w:t xml:space="preserve"> </w:t>
             </w:r>
           </w:p>
         </w:tc>
@@ -5392,6 +5902,43 @@
             </w:r>
           </w:p>
         </w:tc>
+        <w:tc>
+          <w:tcPr>
+            <w:tcW w:w="0" w:type="auto"/>
+            <w:tcBorders>
+              <w:top w:val="single" w:sz="6" w:space="0" w:color="auto"/>
+              <w:left w:val="single" w:sz="6" w:space="0" w:color="auto"/>
+              <w:bottom w:val="single" w:sz="6" w:space="0" w:color="auto"/>
+            </w:tcBorders>
+          </w:tcPr>
+          <w:p>
+            <w:pPr>
+              <w:pStyle w:val="ListContinue2"/>
+              <w:ind w:left="284"/>
+              <w:rPr>
+                <w:lang w:val="en-CA"/>
+              </w:rPr>
+            </w:pPr>
+            <w:r>
+              <w:rPr>
+                <w:lang w:val="en-CA"/>
+              </w:rPr>
+              <w:t>Lost update</w:t>
+            </w:r>
+            <w:r>
+              <w:rPr>
+                <w:lang w:val="en-CA"/>
+              </w:rPr>
+              <w:t xml:space="preserve"> on A</w:t>
+            </w:r>
+            <w:r>
+              <w:rPr>
+                <w:lang w:val="en-CA"/>
+              </w:rPr>
+              <w:t xml:space="preserve">  </w:t>
+            </w:r>
+          </w:p>
+        </w:tc>
       </w:tr>
       <w:tr>
         <w:tc>
@@ -5458,21 +6005,44 @@
             </w:r>
           </w:p>
         </w:tc>
+        <w:tc>
+          <w:tcPr>
+            <w:tcW w:w="0" w:type="auto"/>
+            <w:tcBorders>
+              <w:top w:val="single" w:sz="6" w:space="0" w:color="auto"/>
+              <w:left w:val="single" w:sz="6" w:space="0" w:color="auto"/>
+              <w:bottom w:val="single" w:sz="6" w:space="0" w:color="auto"/>
+            </w:tcBorders>
+          </w:tcPr>
+          <w:p>
+            <w:pPr>
+              <w:pStyle w:val="ListContinue2"/>
+              <w:ind w:left="284"/>
+              <w:rPr>
+                <w:lang w:val="en-CA"/>
+              </w:rPr>
+            </w:pPr>
+          </w:p>
+        </w:tc>
       </w:tr>
     </w:tbl>
     <w:p>
       <w:pPr>
         <w:pStyle w:val="ListNumber"/>
         <w:keepNext/>
-        <w:ind w:left="357" w:hanging="357"/>
-        <w:rPr>
-          <w:lang w:val="en-CA"/>
-        </w:rPr>
-      </w:pPr>
-      <w:r>
-        <w:rPr>
-          <w:lang w:val="en-CA"/>
-        </w:rPr>
+        <w:numPr>
+          <w:ilvl w:val="0"/>
+          <w:numId w:val="0"/>
+        </w:numPr>
+        <w:rPr>
+          <w:lang w:val="en-CA"/>
+        </w:rPr>
+      </w:pPr>
+      <w:r>
+        <w:rPr>
+          <w:lang w:val="en-CA"/>
+        </w:rPr>
+        <w:lastRenderedPageBreak/>
         <w:t>(</w:t>
       </w:r>
       <w:r>
@@ -5489,21 +6059,13 @@
         </w:rPr>
         <w:t>) Consider the two application environments represented in Figure 1 and Figure 2. Identify the various security considerations that are relevant to each environment.</w:t>
       </w:r>
-    </w:p>
-    <w:p>
-      <w:pPr>
-        <w:pStyle w:val="NoSpacing"/>
-        <w:rPr>
-          <w:lang w:val="en-CA"/>
-        </w:rPr>
-      </w:pPr>
       <w:r>
         <w:rPr>
           <w:noProof/>
           <w:lang w:val="en-CA"/>
         </w:rPr>
         <w:drawing>
-          <wp:inline distT="0" distB="0" distL="0" distR="0" wp14:anchorId="5EF9D007" wp14:editId="0B0AB485">
+          <wp:inline distT="0" distB="0" distL="0" distR="0" wp14:anchorId="5EF9D007" wp14:editId="61E6D573">
             <wp:extent cx="6400800" cy="1741170"/>
             <wp:effectExtent l="0" t="0" r="0" b="0"/>
             <wp:docPr id="5" name="Picture 5" descr="Graphical user interface&#10;&#10;Description automatically generated with low confidence"/>
@@ -5537,6 +6099,14 @@
                     <a:prstGeom prst="rect">
                       <a:avLst/>
                     </a:prstGeom>
+                    <a:solidFill>
+                      <a:schemeClr val="bg1">
+                        <a:lumMod val="95000"/>
+                      </a:schemeClr>
+                    </a:solidFill>
+                    <a:ln>
+                      <a:noFill/>
+                    </a:ln>
                   </pic:spPr>
                 </pic:pic>
               </a:graphicData>
@@ -5572,7 +6142,7 @@
           <w:lang w:val="en-CA"/>
         </w:rPr>
         <w:drawing>
-          <wp:inline distT="0" distB="0" distL="0" distR="0" wp14:anchorId="6495C686" wp14:editId="0AB8E6BE">
+          <wp:inline distT="0" distB="0" distL="0" distR="0" wp14:anchorId="6495C686" wp14:editId="6C1143D3">
             <wp:extent cx="6400800" cy="1753870"/>
             <wp:effectExtent l="0" t="0" r="0" b="0"/>
             <wp:docPr id="6" name="Picture 6" descr="Diagram&#10;&#10;Description automatically generated"/>
@@ -5606,6 +6176,11 @@
                     <a:prstGeom prst="rect">
                       <a:avLst/>
                     </a:prstGeom>
+                    <a:solidFill>
+                      <a:schemeClr val="bg1">
+                        <a:lumMod val="95000"/>
+                      </a:schemeClr>
+                    </a:solidFill>
                   </pic:spPr>
                 </pic:pic>
               </a:graphicData>
@@ -5626,6 +6201,976 @@
           <w:lang w:val="en-CA"/>
         </w:rPr>
         <w:t>Figure 2: Dynamic page request</w:t>
+      </w:r>
+    </w:p>
+    <w:p>
+      <w:pPr>
+        <w:rPr>
+          <w:b/>
+          <w:bCs/>
+          <w:sz w:val="22"/>
+          <w:szCs w:val="20"/>
+          <w:lang w:val="en-CA" w:bidi="en-US"/>
+        </w:rPr>
+      </w:pPr>
+      <w:r>
+        <w:rPr>
+          <w:b/>
+          <w:bCs/>
+          <w:sz w:val="22"/>
+          <w:szCs w:val="20"/>
+          <w:lang w:val="en-CA" w:bidi="en-US"/>
+        </w:rPr>
+        <w:t>Static page request</w:t>
+      </w:r>
+    </w:p>
+    <w:p>
+      <w:pPr>
+        <w:pStyle w:val="ListParagraph"/>
+        <w:numPr>
+          <w:ilvl w:val="0"/>
+          <w:numId w:val="123"/>
+        </w:numPr>
+        <w:rPr>
+          <w:sz w:val="22"/>
+          <w:szCs w:val="20"/>
+          <w:lang w:val="en-CA"/>
+        </w:rPr>
+      </w:pPr>
+      <w:r>
+        <w:rPr>
+          <w:sz w:val="22"/>
+          <w:szCs w:val="20"/>
+          <w:lang w:val="en-CA"/>
+        </w:rPr>
+        <w:t>Static pages are rendered from precompiled or predetermined web content. The content is unchanging and is usually read from a non-</w:t>
+      </w:r>
+      <w:proofErr w:type="spellStart"/>
+      <w:r>
+        <w:rPr>
+          <w:sz w:val="22"/>
+          <w:szCs w:val="20"/>
+          <w:lang w:val="en-CA"/>
+        </w:rPr>
+        <w:t>voltile</w:t>
+      </w:r>
+      <w:proofErr w:type="spellEnd"/>
+      <w:r>
+        <w:rPr>
+          <w:sz w:val="22"/>
+          <w:szCs w:val="20"/>
+          <w:lang w:val="en-CA"/>
+        </w:rPr>
+        <w:t xml:space="preserve"> storage mechanism, like a </w:t>
+      </w:r>
+      <w:proofErr w:type="spellStart"/>
+      <w:r>
+        <w:rPr>
+          <w:sz w:val="22"/>
+          <w:szCs w:val="20"/>
+          <w:lang w:val="en-CA"/>
+        </w:rPr>
+        <w:t>harddrive</w:t>
+      </w:r>
+      <w:proofErr w:type="spellEnd"/>
+      <w:r>
+        <w:rPr>
+          <w:sz w:val="22"/>
+          <w:szCs w:val="20"/>
+          <w:lang w:val="en-CA"/>
+        </w:rPr>
+        <w:t xml:space="preserve">.  The site contents </w:t>
+      </w:r>
+      <w:proofErr w:type="gramStart"/>
+      <w:r>
+        <w:rPr>
+          <w:sz w:val="22"/>
+          <w:szCs w:val="20"/>
+          <w:lang w:val="en-CA"/>
+        </w:rPr>
+        <w:t>is</w:t>
+      </w:r>
+      <w:proofErr w:type="gramEnd"/>
+      <w:r>
+        <w:rPr>
+          <w:sz w:val="22"/>
+          <w:szCs w:val="20"/>
+          <w:lang w:val="en-CA"/>
+        </w:rPr>
+        <w:t xml:space="preserve"> read into fast access memory and served to users as requested. </w:t>
+      </w:r>
+    </w:p>
+    <w:p>
+      <w:pPr>
+        <w:pStyle w:val="ListParagraph"/>
+        <w:numPr>
+          <w:ilvl w:val="0"/>
+          <w:numId w:val="123"/>
+        </w:numPr>
+        <w:rPr>
+          <w:sz w:val="22"/>
+          <w:szCs w:val="20"/>
+          <w:lang w:val="en-CA"/>
+        </w:rPr>
+      </w:pPr>
+      <w:r>
+        <w:rPr>
+          <w:sz w:val="22"/>
+          <w:szCs w:val="20"/>
+          <w:lang w:val="en-CA"/>
+        </w:rPr>
+        <w:t xml:space="preserve">Since the </w:t>
+      </w:r>
+      <w:r>
+        <w:rPr>
+          <w:sz w:val="22"/>
+          <w:szCs w:val="20"/>
+          <w:lang w:val="en-CA"/>
+        </w:rPr>
+        <w:t xml:space="preserve">content is established before </w:t>
+      </w:r>
+      <w:r>
+        <w:rPr>
+          <w:sz w:val="22"/>
+          <w:szCs w:val="20"/>
+          <w:lang w:val="en-CA"/>
+        </w:rPr>
+        <w:t xml:space="preserve">being published on the web server, there is no need for application server, or database server in this environment. </w:t>
+      </w:r>
+      <w:r>
+        <w:rPr>
+          <w:sz w:val="22"/>
+          <w:szCs w:val="20"/>
+          <w:lang w:val="en-CA"/>
+        </w:rPr>
+        <w:t>This allows a complete isolation of the webserver, even permitting air-gapping from other servers.</w:t>
+      </w:r>
+    </w:p>
+    <w:p>
+      <w:pPr>
+        <w:pStyle w:val="ListParagraph"/>
+        <w:numPr>
+          <w:ilvl w:val="0"/>
+          <w:numId w:val="123"/>
+        </w:numPr>
+        <w:rPr>
+          <w:sz w:val="22"/>
+          <w:szCs w:val="20"/>
+          <w:lang w:val="en-CA"/>
+        </w:rPr>
+      </w:pPr>
+      <w:r>
+        <w:rPr>
+          <w:sz w:val="22"/>
+          <w:szCs w:val="20"/>
+          <w:lang w:val="en-CA"/>
+        </w:rPr>
+        <w:t xml:space="preserve">The webserver should only respond to request for static web </w:t>
+      </w:r>
+      <w:proofErr w:type="gramStart"/>
+      <w:r>
+        <w:rPr>
+          <w:sz w:val="22"/>
+          <w:szCs w:val="20"/>
+          <w:lang w:val="en-CA"/>
+        </w:rPr>
+        <w:t>pages,</w:t>
+      </w:r>
+      <w:proofErr w:type="gramEnd"/>
+      <w:r>
+        <w:rPr>
+          <w:sz w:val="22"/>
+          <w:szCs w:val="20"/>
+          <w:lang w:val="en-CA"/>
+        </w:rPr>
+        <w:t xml:space="preserve"> any other type should be rejected or redirected.</w:t>
+      </w:r>
+    </w:p>
+    <w:p>
+      <w:pPr>
+        <w:pStyle w:val="ListParagraph"/>
+        <w:numPr>
+          <w:ilvl w:val="0"/>
+          <w:numId w:val="123"/>
+        </w:numPr>
+        <w:rPr>
+          <w:sz w:val="22"/>
+          <w:szCs w:val="20"/>
+          <w:lang w:val="en-CA"/>
+        </w:rPr>
+      </w:pPr>
+      <w:r>
+        <w:rPr>
+          <w:sz w:val="22"/>
+          <w:szCs w:val="20"/>
+          <w:lang w:val="en-CA"/>
+        </w:rPr>
+        <w:t>Static web servers require far less hardware than those of dynamic page content servers</w:t>
+      </w:r>
+      <w:r>
+        <w:rPr>
+          <w:sz w:val="22"/>
+          <w:szCs w:val="20"/>
+          <w:lang w:val="en-CA"/>
+        </w:rPr>
+        <w:t>.</w:t>
+      </w:r>
+      <w:r>
+        <w:rPr>
+          <w:sz w:val="22"/>
+          <w:szCs w:val="20"/>
+          <w:lang w:val="en-CA"/>
+        </w:rPr>
+        <w:t xml:space="preserve"> </w:t>
+      </w:r>
+    </w:p>
+    <w:p>
+      <w:pPr>
+        <w:rPr>
+          <w:b/>
+          <w:bCs/>
+          <w:sz w:val="22"/>
+          <w:szCs w:val="20"/>
+          <w:lang w:val="en-CA" w:bidi="en-US"/>
+        </w:rPr>
+      </w:pPr>
+      <w:r>
+        <w:rPr>
+          <w:b/>
+          <w:bCs/>
+          <w:sz w:val="22"/>
+          <w:szCs w:val="20"/>
+          <w:lang w:val="en-CA" w:bidi="en-US"/>
+        </w:rPr>
+        <w:t>Dynamic page request</w:t>
+      </w:r>
+      <w:r>
+        <w:rPr>
+          <w:b/>
+          <w:bCs/>
+          <w:sz w:val="22"/>
+          <w:szCs w:val="20"/>
+          <w:lang w:val="en-CA" w:bidi="en-US"/>
+        </w:rPr>
+        <w:t xml:space="preserve"> security concerns</w:t>
+      </w:r>
+    </w:p>
+    <w:p>
+      <w:pPr>
+        <w:rPr>
+          <w:sz w:val="22"/>
+          <w:szCs w:val="20"/>
+          <w:lang w:val="en-CA" w:bidi="en-US"/>
+        </w:rPr>
+      </w:pPr>
+      <w:r>
+        <w:rPr>
+          <w:sz w:val="22"/>
+          <w:szCs w:val="20"/>
+          <w:lang w:val="en-CA" w:bidi="en-US"/>
+        </w:rPr>
+        <w:t>Web Server:</w:t>
+      </w:r>
+    </w:p>
+    <w:p>
+      <w:pPr>
+        <w:pStyle w:val="ListParagraph"/>
+        <w:numPr>
+          <w:ilvl w:val="0"/>
+          <w:numId w:val="123"/>
+        </w:numPr>
+        <w:rPr>
+          <w:sz w:val="22"/>
+          <w:szCs w:val="20"/>
+          <w:lang w:val="en-CA"/>
+        </w:rPr>
+      </w:pPr>
+      <w:proofErr w:type="gramStart"/>
+      <w:r>
+        <w:rPr>
+          <w:sz w:val="22"/>
+          <w:szCs w:val="20"/>
+          <w:lang w:val="en-CA"/>
+        </w:rPr>
+        <w:t>In the event that</w:t>
+      </w:r>
+      <w:proofErr w:type="gramEnd"/>
+      <w:r>
+        <w:rPr>
+          <w:sz w:val="22"/>
+          <w:szCs w:val="20"/>
+          <w:lang w:val="en-CA"/>
+        </w:rPr>
+        <w:t xml:space="preserve"> any dependency of the </w:t>
+      </w:r>
+      <w:r>
+        <w:rPr>
+          <w:sz w:val="22"/>
+          <w:szCs w:val="20"/>
+          <w:lang w:val="en-CA"/>
+        </w:rPr>
+        <w:t>Web Server, including the Application Server, database driver, or Database Server are unavailable, the</w:t>
+      </w:r>
+      <w:r>
+        <w:rPr>
+          <w:sz w:val="22"/>
+          <w:szCs w:val="20"/>
+          <w:lang w:val="en-CA"/>
+        </w:rPr>
+        <w:t xml:space="preserve">re should be no negative impact on the </w:t>
+      </w:r>
+      <w:proofErr w:type="gramStart"/>
+      <w:r>
+        <w:rPr>
+          <w:sz w:val="22"/>
+          <w:szCs w:val="20"/>
+          <w:lang w:val="en-CA"/>
+        </w:rPr>
+        <w:t>servers</w:t>
+      </w:r>
+      <w:proofErr w:type="gramEnd"/>
+      <w:r>
+        <w:rPr>
+          <w:sz w:val="22"/>
+          <w:szCs w:val="20"/>
+          <w:lang w:val="en-CA"/>
+        </w:rPr>
+        <w:t xml:space="preserve"> resources, availability or performance.</w:t>
+      </w:r>
+      <w:r>
+        <w:rPr>
+          <w:sz w:val="22"/>
+          <w:szCs w:val="20"/>
+          <w:lang w:val="en-CA"/>
+        </w:rPr>
+        <w:t xml:space="preserve"> </w:t>
+      </w:r>
+    </w:p>
+    <w:p>
+      <w:pPr>
+        <w:pStyle w:val="ListParagraph"/>
+        <w:numPr>
+          <w:ilvl w:val="0"/>
+          <w:numId w:val="123"/>
+        </w:numPr>
+        <w:rPr>
+          <w:sz w:val="22"/>
+          <w:szCs w:val="20"/>
+          <w:lang w:val="en-CA"/>
+        </w:rPr>
+      </w:pPr>
+      <w:r>
+        <w:rPr>
+          <w:sz w:val="22"/>
+          <w:szCs w:val="20"/>
+          <w:lang w:val="en-CA"/>
+        </w:rPr>
+        <w:t>Web servers must also validate against the types of requests like static pages, however the file extension filter may expand to include additional types, as requests may be passed through from website to application server.</w:t>
+      </w:r>
+    </w:p>
+    <w:p>
+      <w:pPr>
+        <w:pStyle w:val="ListParagraph"/>
+        <w:ind w:left="1003"/>
+        <w:rPr>
+          <w:sz w:val="22"/>
+          <w:szCs w:val="20"/>
+          <w:lang w:val="en-CA"/>
+        </w:rPr>
+      </w:pPr>
+    </w:p>
+    <w:p>
+      <w:pPr>
+        <w:pStyle w:val="NoSpacing"/>
+        <w:rPr>
+          <w:lang w:val="en-CA"/>
+        </w:rPr>
+      </w:pPr>
+      <w:r>
+        <w:rPr>
+          <w:lang w:val="en-CA"/>
+        </w:rPr>
+        <w:lastRenderedPageBreak/>
+        <w:t>Application Server</w:t>
+      </w:r>
+    </w:p>
+    <w:p>
+      <w:pPr>
+        <w:pStyle w:val="NoSpacing"/>
+        <w:numPr>
+          <w:ilvl w:val="0"/>
+          <w:numId w:val="123"/>
+        </w:numPr>
+        <w:rPr>
+          <w:lang w:val="en-CA"/>
+        </w:rPr>
+      </w:pPr>
+      <w:r>
+        <w:rPr>
+          <w:lang w:val="en-CA"/>
+        </w:rPr>
+        <w:t xml:space="preserve">Application server must only accept incoming connections from the webserver via accepted protocol or port. No other connections should be permitted unless </w:t>
+      </w:r>
+      <w:proofErr w:type="gramStart"/>
+      <w:r>
+        <w:rPr>
+          <w:lang w:val="en-CA"/>
+        </w:rPr>
+        <w:t>absolutely necessary</w:t>
+      </w:r>
+      <w:proofErr w:type="gramEnd"/>
+      <w:r>
+        <w:rPr>
+          <w:lang w:val="en-CA"/>
+        </w:rPr>
+        <w:t>.</w:t>
+      </w:r>
+    </w:p>
+    <w:p>
+      <w:pPr>
+        <w:pStyle w:val="NoSpacing"/>
+        <w:numPr>
+          <w:ilvl w:val="0"/>
+          <w:numId w:val="123"/>
+        </w:numPr>
+        <w:rPr>
+          <w:lang w:val="en-CA"/>
+        </w:rPr>
+      </w:pPr>
+      <w:r>
+        <w:rPr>
+          <w:lang w:val="en-CA"/>
+        </w:rPr>
+        <w:t>Application server must authenticate the webserver to ensure the webserver is who is making the connection</w:t>
+      </w:r>
+    </w:p>
+    <w:p>
+      <w:pPr>
+        <w:pStyle w:val="NoSpacing"/>
+        <w:numPr>
+          <w:ilvl w:val="0"/>
+          <w:numId w:val="123"/>
+        </w:numPr>
+        <w:rPr>
+          <w:lang w:val="en-CA"/>
+        </w:rPr>
+      </w:pPr>
+      <w:r>
+        <w:rPr>
+          <w:lang w:val="en-CA"/>
+        </w:rPr>
+        <w:t>Depending on the application, some web servers may use impersonation as a form of authentication, meaning the client credentials provided from the client are then passed to the application server, further ensuring that system resources are used only by authorized individuals.</w:t>
+      </w:r>
+    </w:p>
+    <w:p>
+      <w:pPr>
+        <w:pStyle w:val="NoSpacing"/>
+        <w:numPr>
+          <w:ilvl w:val="0"/>
+          <w:numId w:val="123"/>
+        </w:numPr>
+        <w:rPr>
+          <w:lang w:val="en-CA"/>
+        </w:rPr>
+      </w:pPr>
+      <w:r>
+        <w:rPr>
+          <w:lang w:val="en-CA"/>
+        </w:rPr>
+        <w:t>All actions should be logged for troubleshooting and auditing purposes.</w:t>
+      </w:r>
+    </w:p>
+    <w:p>
+      <w:pPr>
+        <w:pStyle w:val="ListParagraph"/>
+        <w:numPr>
+          <w:ilvl w:val="0"/>
+          <w:numId w:val="123"/>
+        </w:numPr>
+        <w:rPr>
+          <w:sz w:val="22"/>
+          <w:szCs w:val="20"/>
+          <w:lang w:val="en-CA"/>
+        </w:rPr>
+      </w:pPr>
+      <w:r>
+        <w:rPr>
+          <w:sz w:val="22"/>
+          <w:szCs w:val="20"/>
+          <w:lang w:val="en-CA"/>
+        </w:rPr>
+        <w:t xml:space="preserve">The server must contain its own protections to ensure that the code being executed on the server does not access any resources outside of its </w:t>
+      </w:r>
+      <w:proofErr w:type="gramStart"/>
+      <w:r>
+        <w:rPr>
+          <w:sz w:val="22"/>
+          <w:szCs w:val="20"/>
+          <w:lang w:val="en-CA"/>
+        </w:rPr>
+        <w:t>domain, or</w:t>
+      </w:r>
+      <w:proofErr w:type="gramEnd"/>
+      <w:r>
+        <w:rPr>
+          <w:sz w:val="22"/>
+          <w:szCs w:val="20"/>
+          <w:lang w:val="en-CA"/>
+        </w:rPr>
+        <w:t xml:space="preserve"> can improperly use.  Improper code, either intentional or accidentally, can cause information to be damaged or released, physical damage to hardware, reduction of availability or consumption of one or all available resources of the server</w:t>
+      </w:r>
+    </w:p>
+    <w:p>
+      <w:pPr>
+        <w:pStyle w:val="NoSpacing"/>
+        <w:rPr>
+          <w:lang w:val="en-CA"/>
+        </w:rPr>
+      </w:pPr>
+    </w:p>
+    <w:p>
+      <w:pPr>
+        <w:pStyle w:val="NoSpacing"/>
+        <w:rPr>
+          <w:lang w:val="en-CA"/>
+        </w:rPr>
+      </w:pPr>
+      <w:r>
+        <w:rPr>
+          <w:lang w:val="en-CA"/>
+        </w:rPr>
+        <w:t>Database Server</w:t>
+      </w:r>
+    </w:p>
+    <w:p>
+      <w:pPr>
+        <w:pStyle w:val="NoSpacing"/>
+        <w:numPr>
+          <w:ilvl w:val="0"/>
+          <w:numId w:val="123"/>
+        </w:numPr>
+        <w:rPr>
+          <w:lang w:val="en-CA"/>
+        </w:rPr>
+      </w:pPr>
+      <w:r>
+        <w:rPr>
+          <w:lang w:val="en-CA"/>
+        </w:rPr>
+        <w:t xml:space="preserve">Network filters should be put in place to only allow connections from the Application </w:t>
+      </w:r>
+      <w:proofErr w:type="gramStart"/>
+      <w:r>
+        <w:rPr>
+          <w:lang w:val="en-CA"/>
+        </w:rPr>
+        <w:t>Server,</w:t>
+      </w:r>
+      <w:proofErr w:type="gramEnd"/>
+      <w:r>
+        <w:rPr>
+          <w:lang w:val="en-CA"/>
+        </w:rPr>
+        <w:t xml:space="preserve"> this can be done using IP or MAC address filtering.</w:t>
+      </w:r>
+    </w:p>
+    <w:p>
+      <w:pPr>
+        <w:pStyle w:val="NoSpacing"/>
+        <w:numPr>
+          <w:ilvl w:val="0"/>
+          <w:numId w:val="123"/>
+        </w:numPr>
+        <w:rPr>
+          <w:lang w:val="en-CA"/>
+        </w:rPr>
+      </w:pPr>
+      <w:r>
+        <w:rPr>
+          <w:lang w:val="en-CA"/>
+        </w:rPr>
+        <w:t>The database server must authenticate the user attempting to connect to the database server, as well as ensure that user does not access any resources, objects, or data that they should not have access to.</w:t>
+      </w:r>
+    </w:p>
+    <w:p>
+      <w:pPr>
+        <w:pStyle w:val="NoSpacing"/>
+        <w:numPr>
+          <w:ilvl w:val="0"/>
+          <w:numId w:val="123"/>
+        </w:numPr>
+        <w:rPr>
+          <w:lang w:val="en-CA"/>
+        </w:rPr>
+      </w:pPr>
+      <w:r>
+        <w:rPr>
+          <w:lang w:val="en-CA"/>
+        </w:rPr>
+        <w:t>All connection activities, regardless of outcome, must also be logged</w:t>
+      </w:r>
+    </w:p>
+    <w:p>
+      <w:pPr>
+        <w:pStyle w:val="NoSpacing"/>
+        <w:numPr>
+          <w:ilvl w:val="0"/>
+          <w:numId w:val="123"/>
+        </w:numPr>
+        <w:rPr>
+          <w:lang w:val="en-CA"/>
+        </w:rPr>
+      </w:pPr>
+      <w:r>
+        <w:rPr>
+          <w:lang w:val="en-CA"/>
+        </w:rPr>
+        <w:t>The database server should have a regularly scheduled</w:t>
+      </w:r>
+      <w:r>
+        <w:rPr>
+          <w:lang w:val="en-CA"/>
+        </w:rPr>
+        <w:t xml:space="preserve"> </w:t>
+      </w:r>
+      <w:r>
+        <w:rPr>
+          <w:lang w:val="en-CA"/>
+        </w:rPr>
+        <w:t>backups and restore schedules, with emergency recovery and crisis mitigation plans</w:t>
+      </w:r>
+    </w:p>
+    <w:p>
+      <w:pPr>
+        <w:rPr>
+          <w:sz w:val="22"/>
+          <w:szCs w:val="20"/>
+          <w:lang w:val="en-CA"/>
+        </w:rPr>
+      </w:pPr>
+    </w:p>
+    <w:p>
+      <w:pPr>
+        <w:pStyle w:val="NoSpacing"/>
+      </w:pPr>
+    </w:p>
+    <w:p>
+      <w:pPr>
+        <w:pStyle w:val="NoSpacing"/>
+        <w:rPr>
+          <w:b/>
+          <w:bCs/>
+        </w:rPr>
+      </w:pPr>
+      <w:r>
+        <w:rPr>
+          <w:b/>
+          <w:bCs/>
+        </w:rPr>
+        <w:t>Common Security Concerns</w:t>
+      </w:r>
+    </w:p>
+    <w:p>
+      <w:pPr>
+        <w:pStyle w:val="NoSpacing"/>
+      </w:pPr>
+      <w:r>
+        <w:t xml:space="preserve">In addition to those specific environment </w:t>
+      </w:r>
+      <w:r>
+        <w:t xml:space="preserve">security measures, both should employ security </w:t>
+      </w:r>
+      <w:proofErr w:type="gramStart"/>
+      <w:r>
+        <w:t>measure</w:t>
+      </w:r>
+      <w:proofErr w:type="gramEnd"/>
+      <w:r>
+        <w:t xml:space="preserve"> like these:</w:t>
+      </w:r>
+    </w:p>
+    <w:p>
+      <w:pPr>
+        <w:pStyle w:val="NoSpacing"/>
+      </w:pPr>
+    </w:p>
+    <w:p>
+      <w:pPr>
+        <w:pStyle w:val="NoSpacing"/>
+      </w:pPr>
+      <w:r>
+        <w:t>All</w:t>
+      </w:r>
+    </w:p>
+    <w:p>
+      <w:pPr>
+        <w:pStyle w:val="NoSpacing"/>
+        <w:numPr>
+          <w:ilvl w:val="0"/>
+          <w:numId w:val="123"/>
+        </w:numPr>
+      </w:pPr>
+      <w:r>
+        <w:t xml:space="preserve">All servers contain software and most hardware. Proper </w:t>
+      </w:r>
+      <w:proofErr w:type="spellStart"/>
+      <w:r>
+        <w:t>maintaince</w:t>
+      </w:r>
+      <w:proofErr w:type="spellEnd"/>
+      <w:r>
+        <w:t xml:space="preserve"> of hardware and software is a very important security </w:t>
+      </w:r>
+      <w:r>
+        <w:t xml:space="preserve">measure. Software updates can patch security bugs as </w:t>
+      </w:r>
+      <w:proofErr w:type="gramStart"/>
+      <w:r>
+        <w:t>their</w:t>
+      </w:r>
+      <w:proofErr w:type="gramEnd"/>
+      <w:r>
+        <w:t xml:space="preserve"> </w:t>
+      </w:r>
+      <w:proofErr w:type="gramStart"/>
+      <w:r>
+        <w:t>identified, or</w:t>
+      </w:r>
+      <w:proofErr w:type="gramEnd"/>
+      <w:r>
+        <w:t xml:space="preserve"> prevent virus attacks.</w:t>
+      </w:r>
+      <w:r>
+        <w:t xml:space="preserve">  Hardware components also require </w:t>
+      </w:r>
+      <w:proofErr w:type="gramStart"/>
+      <w:r>
+        <w:t>maintenance;</w:t>
+      </w:r>
+      <w:proofErr w:type="gramEnd"/>
+      <w:r>
+        <w:t xml:space="preserve"> cleaning, lubrication of moving parts, replac</w:t>
+      </w:r>
+      <w:r>
+        <w:t>ement of failed or expired hardware etc.</w:t>
+      </w:r>
+    </w:p>
+    <w:p>
+      <w:pPr>
+        <w:pStyle w:val="NoSpacing"/>
+        <w:ind w:left="1003"/>
+      </w:pPr>
+      <w:r>
+        <w:t xml:space="preserve"> </w:t>
+      </w:r>
+    </w:p>
+    <w:p>
+      <w:pPr>
+        <w:pStyle w:val="NoSpacing"/>
+        <w:rPr>
+          <w:lang w:val="en-CA"/>
+        </w:rPr>
+      </w:pPr>
+      <w:r>
+        <w:rPr>
+          <w:lang w:val="en-CA"/>
+        </w:rPr>
+        <w:t>Client</w:t>
+      </w:r>
+    </w:p>
+    <w:p>
+      <w:pPr>
+        <w:pStyle w:val="NoSpacing"/>
+        <w:numPr>
+          <w:ilvl w:val="0"/>
+          <w:numId w:val="123"/>
+        </w:numPr>
+        <w:rPr>
+          <w:lang w:val="en-CA"/>
+        </w:rPr>
+      </w:pPr>
+      <w:r>
+        <w:rPr>
+          <w:lang w:val="en-CA"/>
+        </w:rPr>
+        <w:t xml:space="preserve">Authentication / Authorization: Depending on the nature of the client, there may be authentication and authorization applied to the client. This could be in the form of network domain authentication, </w:t>
+      </w:r>
+      <w:proofErr w:type="gramStart"/>
+      <w:r>
+        <w:rPr>
+          <w:lang w:val="en-CA"/>
+        </w:rPr>
+        <w:t>form based</w:t>
+      </w:r>
+      <w:proofErr w:type="gramEnd"/>
+      <w:r>
+        <w:rPr>
+          <w:lang w:val="en-CA"/>
+        </w:rPr>
+        <w:t xml:space="preserve"> login, cookie or token authentication and more. </w:t>
+      </w:r>
+    </w:p>
+    <w:p>
+      <w:pPr>
+        <w:pStyle w:val="NoSpacing"/>
+        <w:rPr>
+          <w:lang w:val="en-CA"/>
+        </w:rPr>
+      </w:pPr>
+    </w:p>
+    <w:p>
+      <w:pPr>
+        <w:pStyle w:val="NoSpacing"/>
+        <w:rPr>
+          <w:lang w:val="en-CA"/>
+        </w:rPr>
+      </w:pPr>
+      <w:r>
+        <w:rPr>
+          <w:lang w:val="en-CA"/>
+        </w:rPr>
+        <w:t>Web Server</w:t>
+      </w:r>
+    </w:p>
+    <w:p>
+      <w:pPr>
+        <w:pStyle w:val="NoSpacing"/>
+        <w:numPr>
+          <w:ilvl w:val="0"/>
+          <w:numId w:val="123"/>
+        </w:numPr>
+        <w:rPr>
+          <w:lang w:val="en-CA"/>
+        </w:rPr>
+      </w:pPr>
+      <w:r>
+        <w:rPr>
+          <w:lang w:val="en-CA"/>
+        </w:rPr>
+        <w:t>Incoming requests may have network filtering rules applied: connections may be limited or denied to due IP address, IP address ranges, MAC address, authentication, frequency of connections</w:t>
+      </w:r>
+      <w:r>
+        <w:rPr>
+          <w:lang w:val="en-CA"/>
+        </w:rPr>
+        <w:t xml:space="preserve"> (</w:t>
+      </w:r>
+      <w:proofErr w:type="spellStart"/>
+      <w:r>
+        <w:rPr>
+          <w:lang w:val="en-CA"/>
+        </w:rPr>
+        <w:t>DDos</w:t>
+      </w:r>
+      <w:proofErr w:type="spellEnd"/>
+      <w:r>
+        <w:rPr>
+          <w:lang w:val="en-CA"/>
+        </w:rPr>
+        <w:t xml:space="preserve"> protection)</w:t>
+      </w:r>
+      <w:r>
+        <w:rPr>
+          <w:lang w:val="en-CA"/>
+        </w:rPr>
+        <w:t>, recognized request paths / routings</w:t>
+      </w:r>
+      <w:r>
+        <w:rPr>
+          <w:lang w:val="en-CA"/>
+        </w:rPr>
+        <w:t>, URL injection and more. Special protection against scraping or crawling activities may also be taken.</w:t>
+      </w:r>
+    </w:p>
+    <w:p>
+      <w:pPr>
+        <w:pStyle w:val="NoSpacing"/>
+        <w:numPr>
+          <w:ilvl w:val="0"/>
+          <w:numId w:val="123"/>
+        </w:numPr>
+        <w:rPr>
+          <w:lang w:val="en-CA"/>
+        </w:rPr>
+      </w:pPr>
+      <w:r>
+        <w:rPr>
+          <w:lang w:val="en-CA"/>
+        </w:rPr>
+        <w:t>Web servers may always request the client authentication to protect resources, data or functionality against unauthorized access</w:t>
+      </w:r>
+    </w:p>
+    <w:p>
+      <w:pPr>
+        <w:pStyle w:val="NoSpacing"/>
+        <w:numPr>
+          <w:ilvl w:val="0"/>
+          <w:numId w:val="123"/>
+        </w:numPr>
+        <w:rPr>
+          <w:lang w:val="en-CA"/>
+        </w:rPr>
+      </w:pPr>
+      <w:r>
+        <w:rPr>
+          <w:lang w:val="en-CA"/>
+        </w:rPr>
+        <w:t>The webserver must provide secure socket layer protection, by employing SSL certificates. This will provide the client with assurances that the web server is who is claims to be, and that all data transmitted between server and client are properly encrypted and cannot be intercepted.</w:t>
+      </w:r>
+    </w:p>
+    <w:p>
+      <w:pPr>
+        <w:pStyle w:val="NoSpacing"/>
+        <w:numPr>
+          <w:ilvl w:val="0"/>
+          <w:numId w:val="123"/>
+        </w:numPr>
+        <w:rPr>
+          <w:lang w:val="en-CA"/>
+        </w:rPr>
+      </w:pPr>
+      <w:r>
+        <w:rPr>
+          <w:lang w:val="en-CA"/>
+        </w:rPr>
+        <w:t>Web servers should maintain regular backups, consistent software updates and ideally operate in an environment where recovery or restarting of services can be completed quickly.  Ideally web servers would be scalable and able to respond to client demand</w:t>
+      </w:r>
+    </w:p>
+    <w:p>
+      <w:pPr>
+        <w:pStyle w:val="NoSpacing"/>
+        <w:numPr>
+          <w:ilvl w:val="0"/>
+          <w:numId w:val="123"/>
+        </w:numPr>
+        <w:rPr>
+          <w:lang w:val="en-CA"/>
+        </w:rPr>
+      </w:pPr>
+      <w:r>
+        <w:rPr>
+          <w:lang w:val="en-CA"/>
+        </w:rPr>
+        <w:lastRenderedPageBreak/>
+        <w:t>Strict logging of all requests and performance must be enforced</w:t>
+      </w:r>
+    </w:p>
+    <w:p>
+      <w:pPr>
+        <w:pStyle w:val="NoSpacing"/>
+        <w:numPr>
+          <w:ilvl w:val="0"/>
+          <w:numId w:val="123"/>
+        </w:numPr>
+        <w:rPr>
+          <w:lang w:val="en-CA"/>
+        </w:rPr>
+      </w:pPr>
+      <w:r>
+        <w:rPr>
+          <w:lang w:val="en-CA"/>
+        </w:rPr>
+        <w:t>Availability, performance and telemetry should also be considered, as it can provide proactive identification of nefarious users.</w:t>
       </w:r>
     </w:p>
     <w:p>
@@ -6042,7 +7587,7 @@
   <w:abstractNum w:abstractNumId="8" w15:restartNumberingAfterBreak="0">
     <w:nsid w:val="FFFFFF88"/>
     <w:multiLevelType w:val="singleLevel"/>
-    <w:tmpl w:val="809433AE"/>
+    <w:tmpl w:val="E312B4C0"/>
     <w:lvl w:ilvl="0">
       <w:start w:val="1"/>
       <w:numFmt w:val="decimal"/>
@@ -7404,6 +8949,9 @@
   </w:num>
   <w:num w:numId="136" w16cid:durableId="1262447970">
     <w:abstractNumId w:val="3"/>
+  </w:num>
+  <w:num w:numId="137" w16cid:durableId="991717752">
+    <w:abstractNumId w:val="8"/>
   </w:num>
   <w:numIdMacAtCleanup w:val="103"/>
 </w:numbering>

</xml_diff>